<commit_message>
Add footnotes/endnotes and section-break types
Footnotes/endnotes: Inline.Footnote/Endnote mark a point in a paragraph;
Writer assigns ids, prepends the reference-mark run to the note body's first
paragraph, and writes word/footnotes.xml/endnotes.xml (with the standard
separator/continuationSeparator boilerplate) - full round trip through
Reader, CodeGen, Xml, and Json, plus new built-in FootnoteReference/
EndnoteReference/FootnoteText/EndnoteText styles.

Section breaks: SectionProperties.BreakType (NextPageBreak/ContinuousBreak/
EvenPageBreak/OddPageBreak) maps to w:sectPr/w:type.

New FootnotesAndEndnotes scenario; MultipleSections extended to exercise
ContinuousBreak/OddPageBreak. All 24 fast + 20 slow tests pass. MAPPING.md
and README.md updated per CLAUDE.md's checklist.

Co-Authored-By: Claude Sonnet 5 <noreply@anthropic.com>
</commit_message>
<xml_diff>
--- a/tests/Kookerella.FsWordDsl.Tests/Examples/BasicParagraphsAndRuns/output.docx
+++ b/tests/Kookerella.FsWordDsl.Tests/Examples/BasicParagraphsAndRuns/output.docx
@@ -134,5 +134,33 @@
       <w:u w:val="single"/>
     </w:rPr>
   </w:style>
+  <w:style w:type="character" w:styleId="FootnoteReference">
+    <w:name w:val="footnote reference"/>
+    <w:rPr>
+      <w:vertAlign w:val="superscript"/>
+    </w:rPr>
+  </w:style>
+  <w:style w:type="character" w:styleId="EndnoteReference">
+    <w:name w:val="endnote reference"/>
+    <w:rPr>
+      <w:vertAlign w:val="superscript"/>
+    </w:rPr>
+  </w:style>
+  <w:style w:type="paragraph" w:styleId="FootnoteText">
+    <w:name w:val="footnote text"/>
+    <w:basedOn w:val="Normal"/>
+    <w:rPr>
+      <w:sz w:val="20"/>
+      <w:szCs w:val="20"/>
+    </w:rPr>
+  </w:style>
+  <w:style w:type="paragraph" w:styleId="EndnoteText">
+    <w:name w:val="endnote text"/>
+    <w:basedOn w:val="Normal"/>
+    <w:rPr>
+      <w:sz w:val="20"/>
+      <w:szCs w:val="20"/>
+    </w:rPr>
+  </w:style>
 </w:styles>
 </file>
</xml_diff>

<commit_message>
Add paragraph borders/shading, document core properties, and run character formatting
Adds ParagraphFormat.Borders/Shading (reusing the SDK's shared border/shading
element classes), a new DocumentProperties.fs (Title/Author/Subject/Keywords/
Comments/Category/Company, mapped to docProps/core.xml and app.xml), and
RunStyle.SmallCaps/AllCaps/Hidden - wired through Writer, Reader, StyleRegistry,
CodeGen, Xml, and Json, with extended/new test scenarios covering all three.

Co-Authored-By: Claude Sonnet 5 <noreply@anthropic.com>
</commit_message>
<xml_diff>
--- a/tests/Kookerella.FsWordDsl.Tests/Examples/BasicParagraphsAndRuns/output.docx
+++ b/tests/Kookerella.FsWordDsl.Tests/Examples/BasicParagraphsAndRuns/output.docx
@@ -46,6 +46,32 @@
           <w:strike/>
         </w:rPr>
         <w:t>struck through</w:t>
+      </w:r>
+    </w:p>
+    <w:p>
+      <w:r>
+        <w:rPr>
+          <w:smallCaps/>
+        </w:rPr>
+        <w:t>SMALL CAPS</w:t>
+      </w:r>
+      <w:r>
+        <w:t xml:space="preserve"> and </w:t>
+      </w:r>
+      <w:r>
+        <w:rPr>
+          <w:caps/>
+        </w:rPr>
+        <w:t>ALL CAPS</w:t>
+      </w:r>
+      <w:r>
+        <w:t xml:space="preserve"> and </w:t>
+      </w:r>
+      <w:r>
+        <w:rPr>
+          <w:vanish/>
+        </w:rPr>
+        <w:t>hidden text</w:t>
       </w:r>
     </w:p>
     <w:sectPr>

</xml_diff>